<commit_message>
Sem taxa de acesso até novo aviso oficial; rastos ligados; ocorrências decididas
Período gratuito: sem data no código. O fim é anunciado no painel
(Pagamentos), com 30 dias de antecedência no mínimo; as compras abrem
com o anúncio e a app mostra a data. Termos do motorista (pt/tet/en,
versão 2026-09-28), página pública e contrato (cláusula 5.ª) iguais.

Aviso de Privacidade 2026-09-28: percursos anónimos para os mapas
(24 meses) e ocorrências (só a equipa vê, o visado não é avisado, 24
meses depois de tratadas). RASTOS_LIGADOS passa a true; ocorrências
tratadas apagam-se aos 24 meses.

Co-Authored-By: Claude Opus 5.5 <noreply@anthropic.com>
</commit_message>
<xml_diff>
--- a/juridico/3 - Contrato TimorgianaRide e Motorista.docx
+++ b/juridico/3 - Contrato TimorgianaRide e Motorista.docx
@@ -743,7 +743,7 @@
           <w:sz w:val="21"/>
           <w:szCs w:val="21"/>
         </w:rPr>
-        <w:t xml:space="preserve">O acesso à Plataforma é </w:t>
+        <w:t xml:space="preserve">O acesso à Plataforma é gratuito, </w:t>
       </w:r>
       <w:r>
         <w:rPr>
@@ -753,15 +753,15 @@
           <w:sz w:val="21"/>
           <w:szCs w:val="21"/>
         </w:rPr>
-        <w:t xml:space="preserve">gratuito até 30 de abril de 2027</w:t>
-      </w:r>
-      <w:r>
-        <w:rPr>
-          <w:rFonts w:ascii="Calibri" w:cs="Calibri" w:eastAsia="Calibri" w:hAnsi="Calibri"/>
-          <w:sz w:val="21"/>
-          <w:szCs w:val="21"/>
-        </w:rPr>
-        <w:t xml:space="preserve">. A partir dessa data, o acesso passa a depender da aquisição de dias de utilização, de acordo com a tabela seguinte:</w:t>
+        <w:t xml:space="preserve">sem taxa de acesso até novo aviso oficial</w:t>
+      </w:r>
+      <w:r>
+        <w:rPr>
+          <w:rFonts w:ascii="Calibri" w:cs="Calibri" w:eastAsia="Calibri" w:hAnsi="Calibri"/>
+          <w:sz w:val="21"/>
+          <w:szCs w:val="21"/>
+        </w:rPr>
+        <w:t xml:space="preserve">. O fim do período gratuito é anunciado na aplicação com, pelo menos, trinta dias de antecedência, com a indicação do dia em que a cobrança começa. A partir desse dia, o acesso passa a depender da aquisição de dias de utilização, de acordo com a tabela seguinte:</w:t>
       </w:r>
     </w:p>
     <w:tbl>
@@ -2257,7 +2257,7 @@
         <w:sz w:val="15"/>
         <w:szCs w:val="15"/>
       </w:rPr>
-      <w:t xml:space="preserve">Contrato de Utilização da Plataforma  ·  14 de Setembro de 2026  ·  página </w:t>
+      <w:t xml:space="preserve">Contrato de Utilização da Plataforma  ·  28 de Setembro de 2026  ·  página </w:t>
     </w:r>
     <w:r>
       <w:rPr>

</xml_diff>